<commit_message>
feat: refresh the portfolio with a dark burgundy visual system
Rebuild the site around a recruiter-ready dark canvas, with orbit background, glass cards, centered hero portrait, LogoLoop skills, a refined Deloitte experience card, and a locally served resume.

Co-authored-by: Cursor <cursoragent@cursor.com>
</commit_message>
<xml_diff>
--- a/Resume/SaumyaGorantala_Resume.docx
+++ b/Resume/SaumyaGorantala_Resume.docx
@@ -1,6 +1,6 @@
 
 <file path=word/document.xml><?xml version="1.0" encoding="utf-8"?>
-<w:document xmlns:wpc="http://schemas.microsoft.com/office/word/2010/wordprocessingCanvas" xmlns:cx="http://schemas.microsoft.com/office/drawing/2014/chartex" xmlns:cx1="http://schemas.microsoft.com/office/drawing/2015/9/8/chartex" xmlns:cx2="http://schemas.microsoft.com/office/drawing/2015/10/21/chartex" xmlns:cx3="http://schemas.microsoft.com/office/drawing/2016/5/9/chartex" xmlns:cx4="http://schemas.microsoft.com/office/drawing/2016/5/10/chartex" xmlns:cx5="http://schemas.microsoft.com/office/drawing/2016/5/11/chartex" xmlns:cx6="http://schemas.microsoft.com/office/drawing/2016/5/12/chartex" xmlns:cx7="http://schemas.microsoft.com/office/drawing/2016/5/13/chartex" xmlns:cx8="http://schemas.microsoft.com/office/drawing/2016/5/14/chartex" xmlns:mc="http://schemas.openxmlformats.org/markup-compatibility/2006" xmlns:aink="http://schemas.microsoft.com/office/drawing/2016/ink" xmlns:am3d="http://schemas.microsoft.com/office/drawing/2017/model3d" xmlns:o="urn:schemas-microsoft-com:office:office" xmlns:oel="http://schemas.microsoft.com/office/2019/extlst" xmlns:r="http://schemas.openxmlformats.org/officeDocument/2006/relationships" xmlns:m="http://schemas.openxmlformats.org/officeDocument/2006/math" xmlns:v="urn:schemas-microsoft-com:vml" xmlns:wp14="http://schemas.microsoft.com/office/word/2010/wordprocessingDrawing" xmlns:wp="http://schemas.openxmlformats.org/drawingml/2006/wordprocessingDrawing" xmlns:w10="urn:schemas-microsoft-com:office:word" xmlns:w="http://schemas.openxmlformats.org/wordprocessingml/2006/main" xmlns:w14="http://schemas.microsoft.com/office/word/2010/wordml" xmlns:w15="http://schemas.microsoft.com/office/word/2012/wordml" xmlns:w16cex="http://schemas.microsoft.com/office/word/2018/wordml/cex" xmlns:w16cid="http://schemas.microsoft.com/office/word/2016/wordml/cid" xmlns:w16="http://schemas.microsoft.com/office/word/2018/wordml" xmlns:w16du="http://schemas.microsoft.com/office/word/2023/wordml/word16du" xmlns:w16sdtdh="http://schemas.microsoft.com/office/word/2020/wordml/sdtdatahash" xmlns:w16sdtfl="http://schemas.microsoft.com/office/word/2024/wordml/sdtformatlock" xmlns:w16se="http://schemas.microsoft.com/office/word/2015/wordml/symex" xmlns:wpg="http://schemas.microsoft.com/office/word/2010/wordprocessingGroup" xmlns:wpi="http://schemas.microsoft.com/office/word/2010/wordprocessingInk" xmlns:wne="http://schemas.microsoft.com/office/word/2006/wordml" xmlns:wps="http://schemas.microsoft.com/office/word/2010/wordprocessingShape" mc:Ignorable="w14 w15 w16se w16cid w16 w16cex w16sdtdh w16sdtfl w16du wp14">
+<w:document xmlns:wpc="http://schemas.microsoft.com/office/word/2010/wordprocessingCanvas" xmlns:cx="http://schemas.microsoft.com/office/drawing/2014/chartex" xmlns:cx1="http://schemas.microsoft.com/office/drawing/2015/9/8/chartex" xmlns:cx2="http://schemas.microsoft.com/office/drawing/2015/10/21/chartex" xmlns:cx3="http://schemas.microsoft.com/office/drawing/2016/5/9/chartex" xmlns:cx4="http://schemas.microsoft.com/office/drawing/2016/5/10/chartex" xmlns:cx5="http://schemas.microsoft.com/office/drawing/2016/5/11/chartex" xmlns:cx6="http://schemas.microsoft.com/office/drawing/2016/5/12/chartex" xmlns:cx7="http://schemas.microsoft.com/office/drawing/2016/5/13/chartex" xmlns:cx8="http://schemas.microsoft.com/office/drawing/2016/5/14/chartex" xmlns:mc="http://schemas.openxmlformats.org/markup-compatibility/2006" xmlns:m="http://schemas.openxmlformats.org/officeDocument/2006/math" xmlns:aink="http://schemas.microsoft.com/office/drawing/2016/ink" xmlns:am3d="http://schemas.microsoft.com/office/drawing/2017/model3d" xmlns:oel="http://schemas.microsoft.com/office/2019/extlst" xmlns:r="http://schemas.openxmlformats.org/officeDocument/2006/relationships" xmlns:wp14="http://schemas.microsoft.com/office/word/2010/wordprocessingDrawing" xmlns:wp="http://schemas.openxmlformats.org/drawingml/2006/wordprocessingDrawing" xmlns:wpg="http://schemas.microsoft.com/office/word/2010/wordprocessingGroup" xmlns:wpi="http://schemas.microsoft.com/office/word/2010/wordprocessingInk" xmlns:wps="http://schemas.microsoft.com/office/word/2010/wordprocessingShape" xmlns:o="urn:schemas-microsoft-com:office:office" xmlns:v="urn:schemas-microsoft-com:vml" xmlns:w10="urn:schemas-microsoft-com:office:word" xmlns:w="http://schemas.openxmlformats.org/wordprocessingml/2006/main" xmlns:w14="http://schemas.microsoft.com/office/word/2010/wordml" xmlns:w15="http://schemas.microsoft.com/office/word/2012/wordml" xmlns:w16cex="http://schemas.microsoft.com/office/word/2018/wordml/cex" xmlns:w16cid="http://schemas.microsoft.com/office/word/2016/wordml/cid" xmlns:w16="http://schemas.microsoft.com/office/word/2018/wordml" xmlns:w16sdtdh="http://schemas.microsoft.com/office/word/2020/wordml/sdtdatahash" xmlns:w16sdtfl="http://schemas.microsoft.com/office/word/2024/wordml/sdtformatlock" xmlns:w16se="http://schemas.microsoft.com/office/word/2015/wordml/symex" xmlns:w16du="http://schemas.microsoft.com/office/word/2023/wordml/word16du" xmlns:wne="http://schemas.microsoft.com/office/word/2006/wordml" mc:Ignorable="w14 w15 w16se w16cid w16 w16cex w16sdtdh w16sdtfl w16du wp14">
   <w:body>
     <w:p>
       <w:pPr>
@@ -408,8 +408,8 @@
           <w:color w:val="000000" w:themeColor="text1"/>
           <w:spacing w:val="-2"/>
           <w:w w:val="105"/>
-          <w:sz w:val="10"/>
-          <w:szCs w:val="10"/>
+          <w:sz w:val="4"/>
+          <w:szCs w:val="4"/>
         </w:rPr>
       </w:pPr>
       <w:bookmarkStart w:id="0" w:name="Summary"/>
@@ -559,8 +559,8 @@
         <w:rPr>
           <w:b w:val="0"/>
           <w:bCs w:val="0"/>
-          <w:sz w:val="11"/>
-          <w:szCs w:val="11"/>
+          <w:sz w:val="18"/>
+          <w:szCs w:val="18"/>
         </w:rPr>
       </w:pPr>
       <w:r>
@@ -570,7 +570,7 @@
           <w:sz w:val="18"/>
           <w:szCs w:val="18"/>
         </w:rPr>
-        <w:t xml:space="preserve">MS Information Systems </w:t>
+        <w:t>Data</w:t>
       </w:r>
       <w:r>
         <w:rPr>
@@ -579,7 +579,7 @@
           <w:sz w:val="18"/>
           <w:szCs w:val="18"/>
         </w:rPr>
-        <w:t>student</w:t>
+        <w:t xml:space="preserve"> and AI Engineer</w:t>
       </w:r>
       <w:r>
         <w:rPr>
@@ -588,153 +588,20 @@
           <w:sz w:val="18"/>
           <w:szCs w:val="18"/>
         </w:rPr>
-        <w:t xml:space="preserve"> at Northeastern University with </w:t>
-      </w:r>
-      <w:r>
-        <w:rPr>
+        <w:t xml:space="preserve"> with hands-on consulting experience at Deloitte in data migration, business intelligence, and ERP systems, combined with end-to-end UX design expertise in Figma. Proficient in SQL, Tableau, Oracle ERP Cloud, and full-stack development, with a proven ability to deliver data-driven insights and user-centered solutions across complex, cross-functional projects.</w:t>
+      </w:r>
+    </w:p>
+    <w:p>
+      <w:pPr>
+        <w:pStyle w:val="Heading1"/>
+        <w:rPr>
+          <w:rFonts w:asciiTheme="majorHAnsi" w:hAnsiTheme="majorHAnsi" w:cs="Times New Roman"/>
           <w:b w:val="0"/>
           <w:bCs w:val="0"/>
-          <w:sz w:val="18"/>
-          <w:szCs w:val="18"/>
-        </w:rPr>
-        <w:t xml:space="preserve">hands-on </w:t>
-      </w:r>
-      <w:r>
-        <w:rPr>
-          <w:b w:val="0"/>
-          <w:bCs w:val="0"/>
-          <w:sz w:val="18"/>
-          <w:szCs w:val="18"/>
-        </w:rPr>
-        <w:t xml:space="preserve">experience in data analysis, business intelligence, and ERP systems </w:t>
-      </w:r>
-      <w:r>
-        <w:rPr>
-          <w:b w:val="0"/>
-          <w:bCs w:val="0"/>
-          <w:sz w:val="18"/>
-          <w:szCs w:val="18"/>
-        </w:rPr>
-        <w:t xml:space="preserve">as </w:t>
-      </w:r>
-      <w:r>
-        <w:rPr>
-          <w:b w:val="0"/>
-          <w:bCs w:val="0"/>
-          <w:sz w:val="18"/>
-          <w:szCs w:val="18"/>
-        </w:rPr>
-        <w:t xml:space="preserve">a </w:t>
-      </w:r>
-      <w:r>
-        <w:rPr>
-          <w:b w:val="0"/>
-          <w:bCs w:val="0"/>
-          <w:sz w:val="18"/>
-          <w:szCs w:val="18"/>
-        </w:rPr>
-        <w:t>D</w:t>
-      </w:r>
-      <w:r>
-        <w:rPr>
-          <w:b w:val="0"/>
-          <w:bCs w:val="0"/>
-          <w:sz w:val="18"/>
-          <w:szCs w:val="18"/>
-        </w:rPr>
-        <w:t xml:space="preserve">ata </w:t>
-      </w:r>
-      <w:r>
-        <w:rPr>
-          <w:b w:val="0"/>
-          <w:bCs w:val="0"/>
-          <w:sz w:val="18"/>
-          <w:szCs w:val="18"/>
-        </w:rPr>
-        <w:t>C</w:t>
-      </w:r>
-      <w:r>
-        <w:rPr>
-          <w:b w:val="0"/>
-          <w:bCs w:val="0"/>
-          <w:sz w:val="18"/>
-          <w:szCs w:val="18"/>
-        </w:rPr>
-        <w:t xml:space="preserve">onsulting </w:t>
-      </w:r>
-      <w:r>
-        <w:rPr>
-          <w:b w:val="0"/>
-          <w:bCs w:val="0"/>
-          <w:sz w:val="18"/>
-          <w:szCs w:val="18"/>
-        </w:rPr>
-        <w:t>A</w:t>
-      </w:r>
-      <w:r>
-        <w:rPr>
-          <w:b w:val="0"/>
-          <w:bCs w:val="0"/>
-          <w:sz w:val="18"/>
-          <w:szCs w:val="18"/>
-        </w:rPr>
-        <w:t>nalyst</w:t>
-      </w:r>
-      <w:r>
-        <w:rPr>
-          <w:b w:val="0"/>
-          <w:bCs w:val="0"/>
-          <w:sz w:val="18"/>
-          <w:szCs w:val="18"/>
-        </w:rPr>
-        <w:t xml:space="preserve"> at Deloitte. </w:t>
-      </w:r>
-      <w:r>
-        <w:rPr>
-          <w:b w:val="0"/>
-          <w:bCs w:val="0"/>
-          <w:sz w:val="18"/>
-          <w:szCs w:val="18"/>
-        </w:rPr>
-        <w:t>P</w:t>
-      </w:r>
-      <w:r>
-        <w:rPr>
-          <w:b w:val="0"/>
-          <w:bCs w:val="0"/>
-          <w:sz w:val="18"/>
-          <w:szCs w:val="18"/>
-        </w:rPr>
-        <w:t>air</w:t>
-      </w:r>
-      <w:r>
-        <w:rPr>
-          <w:b w:val="0"/>
-          <w:bCs w:val="0"/>
-          <w:sz w:val="18"/>
-          <w:szCs w:val="18"/>
-        </w:rPr>
-        <w:t xml:space="preserve">s </w:t>
-      </w:r>
-      <w:r>
-        <w:rPr>
-          <w:b w:val="0"/>
-          <w:bCs w:val="0"/>
-          <w:sz w:val="18"/>
-          <w:szCs w:val="18"/>
-        </w:rPr>
-        <w:t>strong technical skills in SQL, Tableau, and Oracle ERP Cloud with end-to-end UX design experience in Figma, approaching every problem with both analytical precision and user-centered thinking.</w:t>
-      </w:r>
-    </w:p>
-    <w:p>
-      <w:pPr>
-        <w:pStyle w:val="Heading1"/>
-        <w:rPr>
-          <w:rFonts w:asciiTheme="majorHAnsi" w:hAnsiTheme="majorHAnsi" w:cs="Times New Roman"/>
           <w:noProof/>
           <w:color w:val="000000" w:themeColor="text1"/>
-          <w:sz w:val="10"/>
-          <w:szCs w:val="10"/>
+          <w:sz w:val="8"/>
+          <w:szCs w:val="8"/>
         </w:rPr>
       </w:pPr>
     </w:p>
@@ -1476,8 +1343,8 @@
           <w:color w:val="000000" w:themeColor="text1"/>
           <w:spacing w:val="-2"/>
           <w:w w:val="105"/>
-          <w:sz w:val="10"/>
-          <w:szCs w:val="10"/>
+          <w:sz w:val="11"/>
+          <w:szCs w:val="11"/>
         </w:rPr>
       </w:pPr>
     </w:p>
@@ -1718,13 +1585,39 @@
         </w:rPr>
         <w:t xml:space="preserve"> </w:t>
       </w:r>
+      <w:proofErr w:type="gramStart"/>
       <w:r>
         <w:rPr>
           <w:rFonts w:cs="Times New Roman"/>
           <w:color w:val="000000" w:themeColor="text1"/>
           <w:w w:val="105"/>
         </w:rPr>
-        <w:t>Python,</w:t>
+        <w:t>Python</w:t>
+      </w:r>
+      <w:r>
+        <w:rPr>
+          <w:rFonts w:cs="Times New Roman"/>
+          <w:color w:val="000000" w:themeColor="text1"/>
+          <w:w w:val="105"/>
+        </w:rPr>
+        <w:t>(</w:t>
+      </w:r>
+      <w:proofErr w:type="gramEnd"/>
+      <w:r>
+        <w:rPr>
+          <w:rFonts w:cs="Times New Roman"/>
+          <w:color w:val="000000" w:themeColor="text1"/>
+          <w:w w:val="105"/>
+        </w:rPr>
+        <w:t>Pandas, NumPy, Matplotlib)</w:t>
+      </w:r>
+      <w:r>
+        <w:rPr>
+          <w:rFonts w:cs="Times New Roman"/>
+          <w:color w:val="000000" w:themeColor="text1"/>
+          <w:w w:val="105"/>
+        </w:rPr>
+        <w:t>,</w:t>
       </w:r>
       <w:r>
         <w:rPr>
@@ -1734,6 +1627,22 @@
           <w:w w:val="115"/>
         </w:rPr>
         <w:t xml:space="preserve"> </w:t>
+      </w:r>
+      <w:r>
+        <w:rPr>
+          <w:rFonts w:cs="Times New Roman"/>
+          <w:color w:val="000000" w:themeColor="text1"/>
+        </w:rPr>
+        <w:t>Jupyter Notebook</w:t>
+      </w:r>
+      <w:r>
+        <w:rPr>
+          <w:rFonts w:cs="Times New Roman"/>
+          <w:color w:val="000000" w:themeColor="text1"/>
+          <w:spacing w:val="-1"/>
+          <w:w w:val="115"/>
+        </w:rPr>
+        <w:t xml:space="preserve">, </w:t>
       </w:r>
       <w:r>
         <w:rPr>
@@ -1836,66 +1745,21 @@
         <w:ind w:left="216" w:firstLine="0"/>
         <w:rPr>
           <w:rFonts w:cs="Times New Roman"/>
-          <w:color w:val="000000" w:themeColor="text1"/>
-        </w:rPr>
-      </w:pPr>
-      <w:r>
-        <w:rPr>
-          <w:rFonts w:cs="Times New Roman"/>
-          <w:b/>
-          <w:bCs/>
-          <w:color w:val="000000" w:themeColor="text1"/>
-        </w:rPr>
-        <w:t>Web Development:</w:t>
-      </w:r>
-      <w:r>
-        <w:rPr>
-          <w:rFonts w:cs="Times New Roman"/>
-          <w:color w:val="000000" w:themeColor="text1"/>
-        </w:rPr>
-        <w:t xml:space="preserve"> HTML, CSS, JavaScript, Bootstrap, </w:t>
-      </w:r>
-      <w:r>
-        <w:rPr>
-          <w:rFonts w:cs="Times New Roman"/>
-          <w:color w:val="000000" w:themeColor="text1"/>
-        </w:rPr>
-        <w:t xml:space="preserve">NodeJS, </w:t>
-      </w:r>
-      <w:r>
-        <w:rPr>
-          <w:rFonts w:cs="Times New Roman"/>
-          <w:color w:val="000000" w:themeColor="text1"/>
-        </w:rPr>
-        <w:t>ReactJ</w:t>
-      </w:r>
-      <w:r>
-        <w:rPr>
-          <w:rFonts w:cs="Times New Roman"/>
-          <w:color w:val="000000" w:themeColor="text1"/>
-        </w:rPr>
-        <w:t>S</w:t>
-      </w:r>
-      <w:r>
-        <w:rPr>
-          <w:rFonts w:cs="Times New Roman"/>
-          <w:color w:val="000000" w:themeColor="text1"/>
-        </w:rPr>
-        <w:t>, Express</w:t>
-      </w:r>
-      <w:r>
-        <w:rPr>
-          <w:rFonts w:cs="Times New Roman"/>
-          <w:color w:val="000000" w:themeColor="text1"/>
-        </w:rPr>
-        <w:t>, Vite</w:t>
-      </w:r>
-      <w:r>
-        <w:rPr>
-          <w:rFonts w:cs="Times New Roman"/>
-          <w:color w:val="000000" w:themeColor="text1"/>
-        </w:rPr>
-        <w:t>, TypeScript</w:t>
+        </w:rPr>
+      </w:pPr>
+      <w:r>
+        <w:rPr>
+          <w:rFonts w:cs="Times New Roman"/>
+          <w:b/>
+          <w:bCs/>
+        </w:rPr>
+        <w:t>ERP and Reporting:</w:t>
+      </w:r>
+      <w:r>
+        <w:rPr>
+          <w:rFonts w:cs="Times New Roman"/>
+        </w:rPr>
+        <w:t xml:space="preserve"> Oracle ERP Cloud, File-Based Data Import (FBDI), BI Reporting Tools, Tableau, Data Analysis, Business Process Analysis</w:t>
       </w:r>
     </w:p>
     <w:p>
@@ -1905,44 +1769,40 @@
         <w:ind w:left="216" w:firstLine="0"/>
         <w:rPr>
           <w:rFonts w:cs="Times New Roman"/>
-          <w:color w:val="000000" w:themeColor="text1"/>
-        </w:rPr>
-      </w:pPr>
-      <w:r>
-        <w:rPr>
-          <w:rFonts w:cs="Times New Roman"/>
-          <w:b/>
-          <w:bCs/>
-        </w:rPr>
-        <w:t xml:space="preserve">ERP </w:t>
-      </w:r>
-      <w:r>
-        <w:rPr>
-          <w:rFonts w:cs="Times New Roman"/>
-          <w:b/>
-          <w:bCs/>
-        </w:rPr>
-        <w:t>and</w:t>
-      </w:r>
-      <w:r>
-        <w:rPr>
-          <w:rFonts w:cs="Times New Roman"/>
-          <w:b/>
-          <w:bCs/>
-        </w:rPr>
-        <w:t xml:space="preserve"> Reporting:</w:t>
-      </w:r>
-      <w:r>
-        <w:rPr>
-          <w:rFonts w:cs="Times New Roman"/>
-        </w:rPr>
-        <w:t xml:space="preserve"> Oracle ERP Cloud, File-Based Data Import (FBDI), BI Reporting Tools, Tableau, Data Analysis, Data Visualization, Business Process Analysis</w:t>
-      </w:r>
-      <w:r>
-        <w:rPr>
-          <w:rFonts w:cs="Times New Roman"/>
-        </w:rPr>
-        <w:t>, Dashboard Design</w:t>
+        </w:rPr>
+      </w:pPr>
+      <w:r>
+        <w:rPr>
+          <w:rFonts w:cs="Times New Roman"/>
+          <w:b/>
+          <w:bCs/>
+        </w:rPr>
+        <w:t>AI-</w:t>
+      </w:r>
+      <w:r>
+        <w:rPr>
+          <w:rFonts w:cs="Times New Roman"/>
+          <w:b/>
+          <w:bCs/>
+        </w:rPr>
+        <w:t>Assisted Tools</w:t>
+      </w:r>
+      <w:r>
+        <w:rPr>
+          <w:rFonts w:cs="Times New Roman"/>
+          <w:b/>
+          <w:bCs/>
+        </w:rPr>
+        <w:t xml:space="preserve">: </w:t>
+      </w:r>
+      <w:r>
+        <w:t xml:space="preserve">GitHub Copilot, ChatGPT, Cursor, </w:t>
+      </w:r>
+      <w:r>
+        <w:t xml:space="preserve">Claude, </w:t>
+      </w:r>
+      <w:r>
+        <w:t>Antigravity (for code generation, data exploration, and technical documentation)</w:t>
       </w:r>
     </w:p>
     <w:p>
@@ -1962,70 +1822,14 @@
           <w:bCs/>
           <w:color w:val="000000" w:themeColor="text1"/>
         </w:rPr>
-        <w:t>Design and Tools:</w:t>
-      </w:r>
-      <w:r>
-        <w:rPr>
-          <w:rFonts w:cs="Times New Roman"/>
-          <w:color w:val="000000" w:themeColor="text1"/>
-        </w:rPr>
-        <w:t xml:space="preserve"> UI/UX Design, Figma, Adobe XD</w:t>
-      </w:r>
-      <w:r>
-        <w:rPr>
-          <w:rFonts w:cs="Times New Roman"/>
-          <w:color w:val="000000" w:themeColor="text1"/>
-        </w:rPr>
-        <w:t xml:space="preserve">, </w:t>
-      </w:r>
-      <w:r>
-        <w:rPr>
-          <w:rFonts w:cs="Times New Roman"/>
-          <w:color w:val="000000" w:themeColor="text1"/>
-        </w:rPr>
-        <w:t>User Research</w:t>
-      </w:r>
-      <w:r>
-        <w:rPr>
-          <w:rFonts w:cs="Times New Roman"/>
-          <w:color w:val="000000" w:themeColor="text1"/>
-        </w:rPr>
-        <w:t xml:space="preserve">, </w:t>
-      </w:r>
-      <w:r>
-        <w:rPr>
-          <w:rFonts w:cs="Times New Roman"/>
-          <w:color w:val="000000" w:themeColor="text1"/>
-        </w:rPr>
-        <w:t>Usability Testing</w:t>
-      </w:r>
-      <w:r>
-        <w:rPr>
-          <w:rFonts w:cs="Times New Roman"/>
-          <w:color w:val="000000" w:themeColor="text1"/>
-        </w:rPr>
-        <w:t xml:space="preserve">, </w:t>
-      </w:r>
-      <w:r>
-        <w:rPr>
-          <w:rFonts w:cs="Times New Roman"/>
-          <w:color w:val="000000" w:themeColor="text1"/>
-        </w:rPr>
-        <w:t>Visual</w:t>
-      </w:r>
-      <w:r>
-        <w:rPr>
-          <w:rFonts w:cs="Times New Roman"/>
-          <w:color w:val="000000" w:themeColor="text1"/>
-        </w:rPr>
-        <w:t xml:space="preserve"> Design</w:t>
-      </w:r>
-      <w:r>
-        <w:rPr>
-          <w:rFonts w:cs="Times New Roman"/>
-          <w:color w:val="000000" w:themeColor="text1"/>
-        </w:rPr>
-        <w:t>, Interaction Design, Wireframing, Prototyping</w:t>
+        <w:t>Web Development:</w:t>
+      </w:r>
+      <w:r>
+        <w:rPr>
+          <w:rFonts w:cs="Times New Roman"/>
+          <w:color w:val="000000" w:themeColor="text1"/>
+        </w:rPr>
+        <w:t xml:space="preserve"> HTML, CSS, JavaScript, Bootstrap, NodeJS, ReactJS, Express, Vite, TypeScript</w:t>
       </w:r>
     </w:p>
     <w:p>
@@ -2045,6 +1849,89 @@
           <w:bCs/>
           <w:color w:val="000000" w:themeColor="text1"/>
         </w:rPr>
+        <w:t>Design and Tools:</w:t>
+      </w:r>
+      <w:r>
+        <w:rPr>
+          <w:rFonts w:cs="Times New Roman"/>
+          <w:color w:val="000000" w:themeColor="text1"/>
+        </w:rPr>
+        <w:t xml:space="preserve"> UI/UX Design, Figma, Adobe XD</w:t>
+      </w:r>
+      <w:r>
+        <w:rPr>
+          <w:rFonts w:cs="Times New Roman"/>
+          <w:color w:val="000000" w:themeColor="text1"/>
+        </w:rPr>
+        <w:t xml:space="preserve">, </w:t>
+      </w:r>
+      <w:r>
+        <w:rPr>
+          <w:rFonts w:cs="Times New Roman"/>
+          <w:color w:val="000000" w:themeColor="text1"/>
+        </w:rPr>
+        <w:t>User Research</w:t>
+      </w:r>
+      <w:r>
+        <w:rPr>
+          <w:rFonts w:cs="Times New Roman"/>
+          <w:color w:val="000000" w:themeColor="text1"/>
+        </w:rPr>
+        <w:t xml:space="preserve">, </w:t>
+      </w:r>
+      <w:r>
+        <w:rPr>
+          <w:rFonts w:cs="Times New Roman"/>
+          <w:color w:val="000000" w:themeColor="text1"/>
+        </w:rPr>
+        <w:t>Usability Testing</w:t>
+      </w:r>
+      <w:r>
+        <w:rPr>
+          <w:rFonts w:cs="Times New Roman"/>
+          <w:color w:val="000000" w:themeColor="text1"/>
+        </w:rPr>
+        <w:t xml:space="preserve">, </w:t>
+      </w:r>
+      <w:r>
+        <w:rPr>
+          <w:rFonts w:cs="Times New Roman"/>
+          <w:color w:val="000000" w:themeColor="text1"/>
+        </w:rPr>
+        <w:t>Visual</w:t>
+      </w:r>
+      <w:r>
+        <w:rPr>
+          <w:rFonts w:cs="Times New Roman"/>
+          <w:color w:val="000000" w:themeColor="text1"/>
+        </w:rPr>
+        <w:t xml:space="preserve"> Design</w:t>
+      </w:r>
+      <w:r>
+        <w:rPr>
+          <w:rFonts w:cs="Times New Roman"/>
+          <w:color w:val="000000" w:themeColor="text1"/>
+        </w:rPr>
+        <w:t>, Interaction Design, Wireframing, Prototyping</w:t>
+      </w:r>
+    </w:p>
+    <w:p>
+      <w:pPr>
+        <w:pStyle w:val="BodyText"/>
+        <w:spacing w:before="80"/>
+        <w:ind w:left="216" w:firstLine="0"/>
+        <w:rPr>
+          <w:rFonts w:cs="Times New Roman"/>
+          <w:color w:val="000000" w:themeColor="text1"/>
+        </w:rPr>
+      </w:pPr>
+      <w:r>
+        <w:rPr>
+          <w:rFonts w:cs="Times New Roman"/>
+          <w:b/>
+          <w:bCs/>
+          <w:color w:val="000000" w:themeColor="text1"/>
+        </w:rPr>
         <w:t>Tools and Frameworks</w:t>
       </w:r>
       <w:r>
@@ -2164,8 +2051,8 @@
           <w:color w:val="000000" w:themeColor="text1"/>
           <w:spacing w:val="-2"/>
           <w:w w:val="105"/>
-          <w:sz w:val="10"/>
-          <w:szCs w:val="10"/>
+          <w:sz w:val="11"/>
+          <w:szCs w:val="11"/>
         </w:rPr>
       </w:pPr>
     </w:p>
@@ -2640,18 +2527,29 @@
           <w:sz w:val="18"/>
           <w:szCs w:val="18"/>
         </w:rPr>
-        <w:t xml:space="preserve"> Oracle Fusion Cloud</w:t>
-      </w:r>
-      <w:r>
-        <w:rPr>
-          <w:rFonts w:ascii="Cambria" w:hAnsi="Cambria"/>
-          <w:sz w:val="18"/>
-          <w:szCs w:val="18"/>
-        </w:rPr>
         <w:t xml:space="preserve"> </w:t>
       </w:r>
       <w:r>
         <w:rPr>
+          <w:rStyle w:val="Strong"/>
+          <w:rFonts w:ascii="Cambria" w:hAnsi="Cambria"/>
+          <w:b w:val="0"/>
+          <w:bCs w:val="0"/>
+          <w:sz w:val="18"/>
+          <w:szCs w:val="18"/>
+        </w:rPr>
+        <w:t>Oracle Fusion Cloud</w:t>
+      </w:r>
+      <w:r>
+        <w:rPr>
+          <w:rFonts w:ascii="Cambria" w:hAnsi="Cambria"/>
+          <w:sz w:val="18"/>
+          <w:szCs w:val="18"/>
+        </w:rPr>
+        <w:t xml:space="preserve"> </w:t>
+      </w:r>
+      <w:r>
+        <w:rPr>
           <w:rFonts w:ascii="Cambria" w:hAnsi="Cambria"/>
           <w:sz w:val="18"/>
           <w:szCs w:val="18"/>
@@ -2670,6 +2568,8 @@
         <w:rPr>
           <w:rStyle w:val="Strong"/>
           <w:rFonts w:ascii="Cambria" w:hAnsi="Cambria"/>
+          <w:b w:val="0"/>
+          <w:bCs w:val="0"/>
           <w:sz w:val="18"/>
           <w:szCs w:val="18"/>
         </w:rPr>
@@ -2679,6 +2579,8 @@
         <w:rPr>
           <w:rStyle w:val="Strong"/>
           <w:rFonts w:ascii="Cambria" w:hAnsi="Cambria"/>
+          <w:b w:val="0"/>
+          <w:bCs w:val="0"/>
           <w:sz w:val="18"/>
           <w:szCs w:val="18"/>
         </w:rPr>
@@ -2705,6 +2607,8 @@
         <w:rPr>
           <w:rStyle w:val="Strong"/>
           <w:rFonts w:ascii="Cambria" w:hAnsi="Cambria"/>
+          <w:b w:val="0"/>
+          <w:bCs w:val="0"/>
           <w:sz w:val="18"/>
           <w:szCs w:val="18"/>
         </w:rPr>
@@ -2714,10 +2618,21 @@
         <w:rPr>
           <w:rStyle w:val="Strong"/>
           <w:rFonts w:ascii="Cambria" w:hAnsi="Cambria"/>
-          <w:sz w:val="18"/>
-          <w:szCs w:val="18"/>
-        </w:rPr>
-        <w:t xml:space="preserve">, </w:t>
+          <w:b w:val="0"/>
+          <w:bCs w:val="0"/>
+          <w:sz w:val="18"/>
+          <w:szCs w:val="18"/>
+        </w:rPr>
+        <w:t>,</w:t>
+      </w:r>
+      <w:r>
+        <w:rPr>
+          <w:rStyle w:val="Strong"/>
+          <w:rFonts w:ascii="Cambria" w:hAnsi="Cambria"/>
+          <w:sz w:val="18"/>
+          <w:szCs w:val="18"/>
+        </w:rPr>
+        <w:t xml:space="preserve"> </w:t>
       </w:r>
       <w:r>
         <w:rPr>
@@ -2773,8 +2688,6 @@
       <w:r>
         <w:rPr>
           <w:rFonts w:ascii="Cambria" w:hAnsi="Cambria"/>
-          <w:b/>
-          <w:bCs/>
           <w:sz w:val="18"/>
           <w:szCs w:val="18"/>
         </w:rPr>
@@ -2807,30 +2720,10 @@
       <w:r>
         <w:rPr>
           <w:rFonts w:ascii="Cambria" w:hAnsi="Cambria"/>
-          <w:b/>
-          <w:bCs/>
-          <w:sz w:val="18"/>
-          <w:szCs w:val="18"/>
-        </w:rPr>
-        <w:t>ERP</w:t>
-      </w:r>
-      <w:r>
-        <w:rPr>
-          <w:rFonts w:ascii="Cambria" w:hAnsi="Cambria"/>
-          <w:sz w:val="18"/>
-          <w:szCs w:val="18"/>
-        </w:rPr>
-        <w:t xml:space="preserve"> </w:t>
-      </w:r>
-      <w:r>
-        <w:rPr>
-          <w:rFonts w:ascii="Cambria" w:hAnsi="Cambria"/>
-          <w:b/>
-          <w:bCs/>
-          <w:sz w:val="18"/>
-          <w:szCs w:val="18"/>
-        </w:rPr>
-        <w:t>dashboards</w:t>
+          <w:sz w:val="18"/>
+          <w:szCs w:val="18"/>
+        </w:rPr>
+        <w:t>ERP dashboards</w:t>
       </w:r>
       <w:r>
         <w:rPr>
@@ -2934,8 +2827,6 @@
       <w:r>
         <w:rPr>
           <w:rFonts w:ascii="Cambria" w:hAnsi="Cambria"/>
-          <w:b/>
-          <w:bCs/>
           <w:sz w:val="18"/>
           <w:szCs w:val="18"/>
         </w:rPr>
@@ -3043,8 +2934,6 @@
       <w:r>
         <w:rPr>
           <w:rFonts w:ascii="Cambria" w:hAnsi="Cambria"/>
-          <w:b/>
-          <w:bCs/>
           <w:sz w:val="18"/>
           <w:szCs w:val="18"/>
         </w:rPr>
@@ -3143,8 +3032,6 @@
       <w:r>
         <w:rPr>
           <w:rFonts w:ascii="Cambria" w:hAnsi="Cambria"/>
-          <w:b/>
-          <w:bCs/>
           <w:sz w:val="18"/>
           <w:szCs w:val="18"/>
         </w:rPr>
@@ -3161,8 +3048,6 @@
       <w:r>
         <w:rPr>
           <w:rFonts w:ascii="Cambria" w:hAnsi="Cambria"/>
-          <w:b/>
-          <w:bCs/>
           <w:sz w:val="18"/>
           <w:szCs w:val="18"/>
         </w:rPr>
@@ -3184,8 +3069,8 @@
         <w:spacing w:before="0" w:beforeAutospacing="0" w:after="0" w:afterAutospacing="0"/>
         <w:rPr>
           <w:rFonts w:asciiTheme="majorHAnsi" w:hAnsiTheme="majorHAnsi"/>
-          <w:sz w:val="10"/>
-          <w:szCs w:val="10"/>
+          <w:sz w:val="8"/>
+          <w:szCs w:val="8"/>
         </w:rPr>
       </w:pPr>
     </w:p>
@@ -3469,47 +3354,7 @@
           <w:szCs w:val="18"/>
         </w:rPr>
         <w:tab/>
-        <w:t xml:space="preserve">       February 2026</w:t>
-      </w:r>
-      <w:r>
-        <w:rPr>
-          <w:rFonts w:ascii="Cambria" w:hAnsi="Cambria"/>
-          <w:b/>
-          <w:bCs/>
-          <w:sz w:val="18"/>
-          <w:szCs w:val="18"/>
-        </w:rPr>
-        <w:t xml:space="preserve"> </w:t>
-      </w:r>
-      <w:r>
-        <w:rPr>
-          <w:rFonts w:ascii="Cambria" w:hAnsi="Cambria"/>
-          <w:b/>
-          <w:bCs/>
-          <w:sz w:val="18"/>
-          <w:szCs w:val="18"/>
-        </w:rPr>
-        <w:t>-</w:t>
-      </w:r>
-      <w:r>
-        <w:rPr>
-          <w:rFonts w:ascii="Cambria" w:hAnsi="Cambria"/>
-          <w:b/>
-          <w:bCs/>
-          <w:sz w:val="18"/>
-          <w:szCs w:val="18"/>
-        </w:rPr>
-        <w:t xml:space="preserve"> </w:t>
-      </w:r>
-      <w:r>
-        <w:rPr>
-          <w:rFonts w:ascii="Cambria" w:hAnsi="Cambria"/>
-          <w:b/>
-          <w:bCs/>
-          <w:sz w:val="18"/>
-          <w:szCs w:val="18"/>
-        </w:rPr>
-        <w:t>March 2026</w:t>
+        <w:t xml:space="preserve">       </w:t>
       </w:r>
     </w:p>
     <w:p>
@@ -3529,7 +3374,41 @@
           <w:sz w:val="18"/>
           <w:szCs w:val="18"/>
         </w:rPr>
-        <w:t>React, TypeScript, Vite (</w:t>
+        <w:t>React, TypeScript, Vite</w:t>
+      </w:r>
+      <w:r>
+        <w:rPr>
+          <w:rFonts w:ascii="Cambria" w:hAnsi="Cambria"/>
+          <w:sz w:val="18"/>
+          <w:szCs w:val="18"/>
+        </w:rPr>
+        <w:t xml:space="preserve">, Python </w:t>
+      </w:r>
+      <w:proofErr w:type="spellStart"/>
+      <w:r>
+        <w:rPr>
+          <w:rFonts w:ascii="Cambria" w:hAnsi="Cambria"/>
+          <w:sz w:val="18"/>
+          <w:szCs w:val="18"/>
+        </w:rPr>
+        <w:t>FastAPI</w:t>
+      </w:r>
+      <w:proofErr w:type="spellEnd"/>
+      <w:r>
+        <w:rPr>
+          <w:rFonts w:ascii="Cambria" w:hAnsi="Cambria"/>
+          <w:sz w:val="18"/>
+          <w:szCs w:val="18"/>
+        </w:rPr>
+        <w:t>, Agentic AI, LLMs</w:t>
+      </w:r>
+      <w:r>
+        <w:rPr>
+          <w:rFonts w:ascii="Cambria" w:hAnsi="Cambria"/>
+          <w:sz w:val="18"/>
+          <w:szCs w:val="18"/>
+        </w:rPr>
+        <w:t xml:space="preserve"> (</w:t>
       </w:r>
       <w:hyperlink r:id="rId11" w:anchor="/" w:history="1">
         <w:r>
@@ -3557,12 +3436,50 @@
         <w:spacing w:before="0" w:beforeAutospacing="0" w:after="0" w:afterAutospacing="0"/>
         <w:ind w:firstLine="221"/>
         <w:rPr>
-          <w:rFonts w:ascii="Cambria" w:eastAsia="Cambria" w:hAnsi="Cambria"/>
-          <w:color w:val="000000" w:themeColor="text1"/>
+          <w:rFonts w:ascii="Cambria" w:hAnsi="Cambria"/>
           <w:sz w:val="2"/>
           <w:szCs w:val="2"/>
         </w:rPr>
       </w:pPr>
+    </w:p>
+    <w:p>
+      <w:pPr>
+        <w:pStyle w:val="NormalWeb"/>
+        <w:numPr>
+          <w:ilvl w:val="0"/>
+          <w:numId w:val="12"/>
+        </w:numPr>
+        <w:spacing w:before="0" w:beforeAutospacing="0"/>
+        <w:rPr>
+          <w:rFonts w:ascii="Cambria" w:hAnsi="Cambria"/>
+          <w:sz w:val="18"/>
+          <w:szCs w:val="18"/>
+        </w:rPr>
+      </w:pPr>
+      <w:r>
+        <w:rPr>
+          <w:rFonts w:ascii="Cambria" w:hAnsi="Cambria"/>
+          <w:sz w:val="18"/>
+          <w:szCs w:val="18"/>
+        </w:rPr>
+        <w:t>Built a full-stack application tracking system with integrated analytics dashboards to visualize application metrics, status progression, and</w:t>
+      </w:r>
+      <w:r>
+        <w:rPr>
+          <w:rFonts w:ascii="Cambria" w:hAnsi="Cambria"/>
+          <w:sz w:val="18"/>
+          <w:szCs w:val="18"/>
+        </w:rPr>
+        <w:t xml:space="preserve"> </w:t>
+      </w:r>
+      <w:r>
+        <w:rPr>
+          <w:rFonts w:ascii="Cambria" w:hAnsi="Cambria"/>
+          <w:sz w:val="18"/>
+          <w:szCs w:val="18"/>
+        </w:rPr>
+        <w:t>timeline trends, translating user requirements into functional features including deadline monitoring and interview scheduling</w:t>
+      </w:r>
     </w:p>
     <w:p>
       <w:pPr>
@@ -3580,100 +3497,43 @@
       </w:pPr>
       <w:r>
         <w:rPr>
-          <w:rFonts w:ascii="Cambria" w:hAnsi="Cambria"/>
-          <w:sz w:val="18"/>
-          <w:szCs w:val="18"/>
-        </w:rPr>
-        <w:t xml:space="preserve">Built a full-cycle job application tracking app using </w:t>
-      </w:r>
-      <w:r>
-        <w:rPr>
-          <w:rFonts w:ascii="Cambria" w:hAnsi="Cambria"/>
-          <w:b/>
-          <w:bCs/>
-          <w:sz w:val="18"/>
-          <w:szCs w:val="18"/>
-        </w:rPr>
-        <w:t>React</w:t>
-      </w:r>
-      <w:r>
-        <w:rPr>
-          <w:rFonts w:ascii="Cambria" w:hAnsi="Cambria"/>
-          <w:sz w:val="18"/>
-          <w:szCs w:val="18"/>
-        </w:rPr>
-        <w:t xml:space="preserve"> and </w:t>
-      </w:r>
-      <w:r>
-        <w:rPr>
-          <w:rFonts w:ascii="Cambria" w:hAnsi="Cambria"/>
-          <w:b/>
-          <w:bCs/>
-          <w:sz w:val="18"/>
-          <w:szCs w:val="18"/>
-        </w:rPr>
-        <w:t>TypeScript</w:t>
-      </w:r>
-      <w:r>
-        <w:rPr>
-          <w:rFonts w:ascii="Cambria" w:hAnsi="Cambria"/>
-          <w:sz w:val="18"/>
-          <w:szCs w:val="18"/>
-        </w:rPr>
-        <w:t xml:space="preserve">, featuring </w:t>
-      </w:r>
-      <w:r>
-        <w:rPr>
-          <w:rFonts w:ascii="Cambria" w:hAnsi="Cambria"/>
-          <w:b/>
-          <w:bCs/>
-          <w:sz w:val="18"/>
-          <w:szCs w:val="18"/>
-        </w:rPr>
-        <w:t>Kanban</w:t>
-      </w:r>
-      <w:r>
-        <w:rPr>
-          <w:rFonts w:ascii="Cambria" w:hAnsi="Cambria"/>
-          <w:sz w:val="18"/>
-          <w:szCs w:val="18"/>
-        </w:rPr>
-        <w:t xml:space="preserve"> workflows and analytics dashboards, to centralize and streamline the entire job search process in one interface, improving organization and visibility across multiple applications </w:t>
-      </w:r>
-    </w:p>
-    <w:p>
-      <w:pPr>
-        <w:pStyle w:val="NormalWeb"/>
-        <w:spacing w:before="0" w:beforeAutospacing="0" w:after="0" w:afterAutospacing="0"/>
-        <w:ind w:left="810"/>
-        <w:rPr>
-          <w:rFonts w:ascii="Cambria" w:hAnsi="Cambria"/>
-          <w:sz w:val="2"/>
-          <w:szCs w:val="2"/>
-        </w:rPr>
-      </w:pPr>
-    </w:p>
-    <w:p>
-      <w:pPr>
-        <w:pStyle w:val="NormalWeb"/>
-        <w:numPr>
-          <w:ilvl w:val="0"/>
-          <w:numId w:val="12"/>
-        </w:numPr>
-        <w:spacing w:before="0" w:beforeAutospacing="0" w:after="0" w:afterAutospacing="0"/>
-        <w:rPr>
-          <w:rFonts w:ascii="Cambria" w:hAnsi="Cambria"/>
-          <w:sz w:val="18"/>
-          <w:szCs w:val="18"/>
-        </w:rPr>
-      </w:pPr>
-      <w:r>
-        <w:rPr>
-          <w:rFonts w:ascii="Cambria" w:hAnsi="Cambria"/>
-          <w:sz w:val="18"/>
-          <w:szCs w:val="18"/>
-        </w:rPr>
-        <w:t xml:space="preserve">Integrated robust reminder systems and calendar features to track job application deadlines, interview schedules, and post-interview follow-ups, ensuring timely action at every stage of the job search process, and preventing any critical steps from being missed </w:t>
+          <w:rFonts w:asciiTheme="majorHAnsi" w:hAnsiTheme="majorHAnsi"/>
+          <w:sz w:val="18"/>
+          <w:szCs w:val="18"/>
+        </w:rPr>
+        <w:t>Integrated AI resume parser using AGNO framework with React frontend</w:t>
+      </w:r>
+      <w:r>
+        <w:rPr>
+          <w:rFonts w:asciiTheme="majorHAnsi" w:hAnsiTheme="majorHAnsi"/>
+          <w:sz w:val="18"/>
+          <w:szCs w:val="18"/>
+        </w:rPr>
+        <w:t xml:space="preserve"> (upload, scoring, chat interface)</w:t>
+      </w:r>
+      <w:r>
+        <w:rPr>
+          <w:rFonts w:asciiTheme="majorHAnsi" w:hAnsiTheme="majorHAnsi"/>
+          <w:sz w:val="18"/>
+          <w:szCs w:val="18"/>
+        </w:rPr>
+        <w:t xml:space="preserve">, </w:t>
+      </w:r>
+      <w:r>
+        <w:rPr>
+          <w:rFonts w:asciiTheme="majorHAnsi" w:hAnsiTheme="majorHAnsi"/>
+          <w:sz w:val="18"/>
+          <w:szCs w:val="18"/>
+        </w:rPr>
+        <w:t>and added custom AI tools to provide</w:t>
+      </w:r>
+      <w:r>
+        <w:rPr>
+          <w:rFonts w:asciiTheme="majorHAnsi" w:hAnsiTheme="majorHAnsi"/>
+          <w:sz w:val="18"/>
+          <w:szCs w:val="18"/>
+        </w:rPr>
+        <w:t xml:space="preserve"> conversational coaching and personalized ATS optimization recommendations based on job description analysis</w:t>
       </w:r>
     </w:p>
     <w:p>
@@ -3719,56 +3579,6 @@
           <w:szCs w:val="20"/>
         </w:rPr>
         <w:t xml:space="preserve">                                                                                                                                  </w:t>
-      </w:r>
-      <w:r>
-        <w:rPr>
-          <w:rFonts w:ascii="Cambria" w:hAnsi="Cambria"/>
-          <w:b/>
-          <w:bCs/>
-          <w:sz w:val="18"/>
-          <w:szCs w:val="18"/>
-        </w:rPr>
-        <w:t>November 2025</w:t>
-      </w:r>
-      <w:r>
-        <w:rPr>
-          <w:rFonts w:ascii="Cambria" w:hAnsi="Cambria"/>
-          <w:b/>
-          <w:bCs/>
-          <w:sz w:val="18"/>
-          <w:szCs w:val="18"/>
-        </w:rPr>
-        <w:t xml:space="preserve"> </w:t>
-      </w:r>
-      <w:r>
-        <w:rPr>
-          <w:rFonts w:ascii="Cambria" w:hAnsi="Cambria"/>
-          <w:b/>
-          <w:bCs/>
-          <w:sz w:val="18"/>
-          <w:szCs w:val="18"/>
-        </w:rPr>
-        <w:t>-</w:t>
-      </w:r>
-      <w:r>
-        <w:rPr>
-          <w:rFonts w:ascii="Cambria" w:hAnsi="Cambria"/>
-          <w:b/>
-          <w:bCs/>
-          <w:sz w:val="18"/>
-          <w:szCs w:val="18"/>
-        </w:rPr>
-        <w:t xml:space="preserve"> </w:t>
-      </w:r>
-      <w:r>
-        <w:rPr>
-          <w:rFonts w:ascii="Cambria" w:hAnsi="Cambria"/>
-          <w:b/>
-          <w:bCs/>
-          <w:sz w:val="18"/>
-          <w:szCs w:val="18"/>
-        </w:rPr>
-        <w:t>January 2026</w:t>
       </w:r>
     </w:p>
     <w:p>
@@ -3865,8 +3675,6 @@
       <w:r>
         <w:rPr>
           <w:rFonts w:ascii="Cambria" w:hAnsi="Cambria"/>
-          <w:b/>
-          <w:bCs/>
           <w:sz w:val="18"/>
           <w:szCs w:val="18"/>
         </w:rPr>
@@ -4038,66 +3846,6 @@
         </w:rPr>
         <w:t xml:space="preserve">                                                                                                                                                                   </w:t>
       </w:r>
-      <w:r>
-        <w:rPr>
-          <w:rFonts w:ascii="Cambria" w:hAnsi="Cambria"/>
-          <w:b/>
-          <w:bCs/>
-          <w:sz w:val="18"/>
-          <w:szCs w:val="18"/>
-        </w:rPr>
-        <w:t>September 2025</w:t>
-      </w:r>
-      <w:r>
-        <w:rPr>
-          <w:rFonts w:ascii="Cambria" w:hAnsi="Cambria"/>
-          <w:b/>
-          <w:bCs/>
-          <w:sz w:val="18"/>
-          <w:szCs w:val="18"/>
-        </w:rPr>
-        <w:t xml:space="preserve"> </w:t>
-      </w:r>
-      <w:r>
-        <w:rPr>
-          <w:rFonts w:ascii="Cambria" w:hAnsi="Cambria"/>
-          <w:b/>
-          <w:bCs/>
-          <w:sz w:val="18"/>
-          <w:szCs w:val="18"/>
-        </w:rPr>
-        <w:t>-</w:t>
-      </w:r>
-      <w:r>
-        <w:rPr>
-          <w:rFonts w:ascii="Cambria" w:hAnsi="Cambria"/>
-          <w:b/>
-          <w:bCs/>
-          <w:sz w:val="18"/>
-          <w:szCs w:val="18"/>
-        </w:rPr>
-        <w:t xml:space="preserve"> </w:t>
-      </w:r>
-      <w:r>
-        <w:rPr>
-          <w:rFonts w:ascii="Cambria" w:hAnsi="Cambria"/>
-          <w:b/>
-          <w:bCs/>
-          <w:sz w:val="18"/>
-          <w:szCs w:val="18"/>
-        </w:rPr>
-        <w:t>November 202</w:t>
-      </w:r>
-      <w:r>
-        <w:rPr>
-          <w:rFonts w:ascii="Cambria" w:hAnsi="Cambria"/>
-          <w:b/>
-          <w:bCs/>
-          <w:sz w:val="18"/>
-          <w:szCs w:val="18"/>
-        </w:rPr>
-        <w:t>5</w:t>
-      </w:r>
     </w:p>
     <w:p>
       <w:pPr>
@@ -4132,7 +3880,23 @@
           <w:sz w:val="18"/>
           <w:szCs w:val="18"/>
         </w:rPr>
-        <w:t xml:space="preserve">App | </w:t>
+        <w:t>App</w:t>
+      </w:r>
+      <w:r>
+        <w:rPr>
+          <w:rFonts w:ascii="Cambria" w:hAnsi="Cambria"/>
+          <w:sz w:val="18"/>
+          <w:szCs w:val="18"/>
+        </w:rPr>
+        <w:t>,</w:t>
+      </w:r>
+      <w:r>
+        <w:rPr>
+          <w:rFonts w:ascii="Cambria" w:hAnsi="Cambria"/>
+          <w:sz w:val="18"/>
+          <w:szCs w:val="18"/>
+        </w:rPr>
+        <w:t xml:space="preserve"> </w:t>
       </w:r>
       <w:r>
         <w:rPr>
@@ -4208,8 +3972,6 @@
       <w:r>
         <w:rPr>
           <w:rFonts w:ascii="Cambria" w:hAnsi="Cambria"/>
-          <w:b/>
-          <w:bCs/>
           <w:sz w:val="18"/>
           <w:szCs w:val="18"/>
         </w:rPr>
@@ -4341,8 +4103,6 @@
       <w:r>
         <w:rPr>
           <w:rFonts w:ascii="Cambria" w:hAnsi="Cambria"/>
-          <w:b/>
-          <w:bCs/>
           <w:sz w:val="18"/>
           <w:szCs w:val="18"/>
         </w:rPr>
@@ -4359,8 +4119,6 @@
       <w:r>
         <w:rPr>
           <w:rFonts w:ascii="Cambria" w:hAnsi="Cambria"/>
-          <w:b/>
-          <w:bCs/>
           <w:sz w:val="18"/>
           <w:szCs w:val="18"/>
         </w:rPr>
@@ -4585,56 +4343,6 @@
         <w:tab/>
         <w:t xml:space="preserve">                                 </w:t>
       </w:r>
-      <w:r>
-        <w:rPr>
-          <w:rFonts w:ascii="Cambria" w:hAnsi="Cambria"/>
-          <w:b/>
-          <w:bCs/>
-          <w:sz w:val="18"/>
-          <w:szCs w:val="18"/>
-        </w:rPr>
-        <w:t>March 2025</w:t>
-      </w:r>
-      <w:r>
-        <w:rPr>
-          <w:rFonts w:ascii="Cambria" w:hAnsi="Cambria"/>
-          <w:b/>
-          <w:bCs/>
-          <w:sz w:val="18"/>
-          <w:szCs w:val="18"/>
-        </w:rPr>
-        <w:t xml:space="preserve"> </w:t>
-      </w:r>
-      <w:r>
-        <w:rPr>
-          <w:rFonts w:ascii="Cambria" w:hAnsi="Cambria"/>
-          <w:b/>
-          <w:bCs/>
-          <w:sz w:val="18"/>
-          <w:szCs w:val="18"/>
-        </w:rPr>
-        <w:t>-</w:t>
-      </w:r>
-      <w:r>
-        <w:rPr>
-          <w:rFonts w:ascii="Cambria" w:hAnsi="Cambria"/>
-          <w:b/>
-          <w:bCs/>
-          <w:sz w:val="18"/>
-          <w:szCs w:val="18"/>
-        </w:rPr>
-        <w:t xml:space="preserve"> </w:t>
-      </w:r>
-      <w:r>
-        <w:rPr>
-          <w:rFonts w:ascii="Cambria" w:hAnsi="Cambria"/>
-          <w:b/>
-          <w:bCs/>
-          <w:sz w:val="18"/>
-          <w:szCs w:val="18"/>
-        </w:rPr>
-        <w:t>May 2025</w:t>
-      </w:r>
     </w:p>
     <w:p>
       <w:pPr>
@@ -4669,7 +4377,23 @@
           <w:sz w:val="18"/>
           <w:szCs w:val="18"/>
         </w:rPr>
-        <w:t xml:space="preserve"> Roommate Matching App | </w:t>
+        <w:t xml:space="preserve"> Roommate Matching App</w:t>
+      </w:r>
+      <w:r>
+        <w:rPr>
+          <w:rFonts w:ascii="Cambria" w:hAnsi="Cambria"/>
+          <w:sz w:val="18"/>
+          <w:szCs w:val="18"/>
+        </w:rPr>
+        <w:t>,</w:t>
+      </w:r>
+      <w:r>
+        <w:rPr>
+          <w:rFonts w:ascii="Cambria" w:hAnsi="Cambria"/>
+          <w:sz w:val="18"/>
+          <w:szCs w:val="18"/>
+        </w:rPr>
+        <w:t xml:space="preserve"> </w:t>
       </w:r>
       <w:r>
         <w:rPr>
@@ -4787,8 +4511,6 @@
       <w:r>
         <w:rPr>
           <w:rFonts w:ascii="Cambria" w:hAnsi="Cambria"/>
-          <w:b/>
-          <w:bCs/>
           <w:sz w:val="18"/>
           <w:szCs w:val="18"/>
         </w:rPr>
@@ -4968,12 +4690,20 @@
       <w:r>
         <w:rPr>
           <w:rFonts w:ascii="Cambria" w:hAnsi="Cambria"/>
-          <w:b/>
-          <w:bCs/>
-          <w:sz w:val="18"/>
-          <w:szCs w:val="18"/>
-        </w:rPr>
-        <w:t xml:space="preserve">high-fidelity </w:t>
+          <w:sz w:val="18"/>
+          <w:szCs w:val="18"/>
+        </w:rPr>
+        <w:t>high-fidelity</w:t>
+      </w:r>
+      <w:r>
+        <w:rPr>
+          <w:rFonts w:ascii="Cambria" w:hAnsi="Cambria"/>
+          <w:b/>
+          <w:bCs/>
+          <w:sz w:val="18"/>
+          <w:szCs w:val="18"/>
+        </w:rPr>
+        <w:t xml:space="preserve"> </w:t>
       </w:r>
       <w:r>
         <w:rPr>
@@ -4991,14 +4721,6 @@
           <w:sz w:val="18"/>
           <w:szCs w:val="18"/>
         </w:rPr>
-        <w:t xml:space="preserve"> wireframes</w:t>
-      </w:r>
-      <w:r>
-        <w:rPr>
-          <w:rFonts w:ascii="Cambria" w:hAnsi="Cambria"/>
-          <w:sz w:val="18"/>
-          <w:szCs w:val="18"/>
-        </w:rPr>
         <w:t xml:space="preserve"> </w:t>
       </w:r>
       <w:r>
@@ -5007,13 +4729,27 @@
           <w:sz w:val="18"/>
           <w:szCs w:val="18"/>
         </w:rPr>
+        <w:t>wireframes</w:t>
+      </w:r>
+      <w:r>
+        <w:rPr>
+          <w:rFonts w:ascii="Cambria" w:hAnsi="Cambria"/>
+          <w:sz w:val="18"/>
+          <w:szCs w:val="18"/>
+        </w:rPr>
+        <w:t xml:space="preserve"> </w:t>
+      </w:r>
+      <w:r>
+        <w:rPr>
+          <w:rFonts w:ascii="Cambria" w:hAnsi="Cambria"/>
+          <w:sz w:val="18"/>
+          <w:szCs w:val="18"/>
+        </w:rPr>
         <w:t xml:space="preserve">and clickable </w:t>
       </w:r>
       <w:r>
         <w:rPr>
           <w:rFonts w:ascii="Cambria" w:hAnsi="Cambria"/>
-          <w:b/>
-          <w:bCs/>
           <w:sz w:val="18"/>
           <w:szCs w:val="18"/>
         </w:rPr>
@@ -5112,7 +4848,7 @@
 </file>
 
 <file path=word/numbering.xml><?xml version="1.0" encoding="utf-8"?>
-<w:numbering xmlns:wpc="http://schemas.microsoft.com/office/word/2010/wordprocessingCanvas" xmlns:cx="http://schemas.microsoft.com/office/drawing/2014/chartex" xmlns:cx1="http://schemas.microsoft.com/office/drawing/2015/9/8/chartex" xmlns:cx2="http://schemas.microsoft.com/office/drawing/2015/10/21/chartex" xmlns:cx3="http://schemas.microsoft.com/office/drawing/2016/5/9/chartex" xmlns:cx4="http://schemas.microsoft.com/office/drawing/2016/5/10/chartex" xmlns:cx5="http://schemas.microsoft.com/office/drawing/2016/5/11/chartex" xmlns:cx6="http://schemas.microsoft.com/office/drawing/2016/5/12/chartex" xmlns:cx7="http://schemas.microsoft.com/office/drawing/2016/5/13/chartex" xmlns:cx8="http://schemas.microsoft.com/office/drawing/2016/5/14/chartex" xmlns:mc="http://schemas.openxmlformats.org/markup-compatibility/2006" xmlns:aink="http://schemas.microsoft.com/office/drawing/2016/ink" xmlns:am3d="http://schemas.microsoft.com/office/drawing/2017/model3d" xmlns:o="urn:schemas-microsoft-com:office:office" xmlns:oel="http://schemas.microsoft.com/office/2019/extlst" xmlns:r="http://schemas.openxmlformats.org/officeDocument/2006/relationships" xmlns:m="http://schemas.openxmlformats.org/officeDocument/2006/math" xmlns:v="urn:schemas-microsoft-com:vml" xmlns:wp14="http://schemas.microsoft.com/office/word/2010/wordprocessingDrawing" xmlns:wp="http://schemas.openxmlformats.org/drawingml/2006/wordprocessingDrawing" xmlns:w10="urn:schemas-microsoft-com:office:word" xmlns:w="http://schemas.openxmlformats.org/wordprocessingml/2006/main" xmlns:w14="http://schemas.microsoft.com/office/word/2010/wordml" xmlns:w15="http://schemas.microsoft.com/office/word/2012/wordml" xmlns:w16cex="http://schemas.microsoft.com/office/word/2018/wordml/cex" xmlns:w16cid="http://schemas.microsoft.com/office/word/2016/wordml/cid" xmlns:w16="http://schemas.microsoft.com/office/word/2018/wordml" xmlns:w16du="http://schemas.microsoft.com/office/word/2023/wordml/word16du" xmlns:w16sdtdh="http://schemas.microsoft.com/office/word/2020/wordml/sdtdatahash" xmlns:w16sdtfl="http://schemas.microsoft.com/office/word/2024/wordml/sdtformatlock" xmlns:w16se="http://schemas.microsoft.com/office/word/2015/wordml/symex" xmlns:wpg="http://schemas.microsoft.com/office/word/2010/wordprocessingGroup" xmlns:wpi="http://schemas.microsoft.com/office/word/2010/wordprocessingInk" xmlns:wne="http://schemas.microsoft.com/office/word/2006/wordml" xmlns:wps="http://schemas.microsoft.com/office/word/2010/wordprocessingShape" mc:Ignorable="w14 w15 w16se w16cid w16 w16cex w16sdtdh w16sdtfl w16du wp14">
+<w:numbering xmlns:wpc="http://schemas.microsoft.com/office/word/2010/wordprocessingCanvas" xmlns:cx="http://schemas.microsoft.com/office/drawing/2014/chartex" xmlns:cx1="http://schemas.microsoft.com/office/drawing/2015/9/8/chartex" xmlns:cx2="http://schemas.microsoft.com/office/drawing/2015/10/21/chartex" xmlns:cx3="http://schemas.microsoft.com/office/drawing/2016/5/9/chartex" xmlns:cx4="http://schemas.microsoft.com/office/drawing/2016/5/10/chartex" xmlns:cx5="http://schemas.microsoft.com/office/drawing/2016/5/11/chartex" xmlns:cx6="http://schemas.microsoft.com/office/drawing/2016/5/12/chartex" xmlns:cx7="http://schemas.microsoft.com/office/drawing/2016/5/13/chartex" xmlns:cx8="http://schemas.microsoft.com/office/drawing/2016/5/14/chartex" xmlns:mc="http://schemas.openxmlformats.org/markup-compatibility/2006" xmlns:m="http://schemas.openxmlformats.org/officeDocument/2006/math" xmlns:aink="http://schemas.microsoft.com/office/drawing/2016/ink" xmlns:am3d="http://schemas.microsoft.com/office/drawing/2017/model3d" xmlns:oel="http://schemas.microsoft.com/office/2019/extlst" xmlns:r="http://schemas.openxmlformats.org/officeDocument/2006/relationships" xmlns:wp14="http://schemas.microsoft.com/office/word/2010/wordprocessingDrawing" xmlns:wp="http://schemas.openxmlformats.org/drawingml/2006/wordprocessingDrawing" xmlns:wpg="http://schemas.microsoft.com/office/word/2010/wordprocessingGroup" xmlns:wpi="http://schemas.microsoft.com/office/word/2010/wordprocessingInk" xmlns:wps="http://schemas.microsoft.com/office/word/2010/wordprocessingShape" xmlns:o="urn:schemas-microsoft-com:office:office" xmlns:v="urn:schemas-microsoft-com:vml" xmlns:w10="urn:schemas-microsoft-com:office:word" xmlns:w="http://schemas.openxmlformats.org/wordprocessingml/2006/main" xmlns:w14="http://schemas.microsoft.com/office/word/2010/wordml" xmlns:w15="http://schemas.microsoft.com/office/word/2012/wordml" xmlns:w16cex="http://schemas.microsoft.com/office/word/2018/wordml/cex" xmlns:w16cid="http://schemas.microsoft.com/office/word/2016/wordml/cid" xmlns:w16="http://schemas.microsoft.com/office/word/2018/wordml" xmlns:w16sdtdh="http://schemas.microsoft.com/office/word/2020/wordml/sdtdatahash" xmlns:w16sdtfl="http://schemas.microsoft.com/office/word/2024/wordml/sdtformatlock" xmlns:w16se="http://schemas.microsoft.com/office/word/2015/wordml/symex" xmlns:w16du="http://schemas.microsoft.com/office/word/2023/wordml/word16du" xmlns:wne="http://schemas.microsoft.com/office/word/2006/wordml" mc:Ignorable="w14 w15 w16se w16cid w16 w16cex w16sdtdh w16sdtfl w16du wp14">
   <w:abstractNum w:abstractNumId="0" w15:restartNumberingAfterBreak="0">
     <w:nsid w:val="08A43A28"/>
     <w:multiLevelType w:val="hybridMultilevel"/>
@@ -6828,7 +6564,7 @@
 </file>
 
 <file path=word/styles.xml><?xml version="1.0" encoding="utf-8"?>
-<w:styles xmlns:mc="http://schemas.openxmlformats.org/markup-compatibility/2006" xmlns:r="http://schemas.openxmlformats.org/officeDocument/2006/relationships" xmlns:w="http://schemas.openxmlformats.org/wordprocessingml/2006/main" xmlns:w14="http://schemas.microsoft.com/office/word/2010/wordml" xmlns:w15="http://schemas.microsoft.com/office/word/2012/wordml" xmlns:w16cex="http://schemas.microsoft.com/office/word/2018/wordml/cex" xmlns:w16cid="http://schemas.microsoft.com/office/word/2016/wordml/cid" xmlns:w16="http://schemas.microsoft.com/office/word/2018/wordml" xmlns:w16du="http://schemas.microsoft.com/office/word/2023/wordml/word16du" xmlns:w16sdtdh="http://schemas.microsoft.com/office/word/2020/wordml/sdtdatahash" xmlns:w16sdtfl="http://schemas.microsoft.com/office/word/2024/wordml/sdtformatlock" xmlns:w16se="http://schemas.microsoft.com/office/word/2015/wordml/symex" mc:Ignorable="w14 w15 w16se w16cid w16 w16cex w16sdtdh w16sdtfl w16du">
+<w:styles xmlns:mc="http://schemas.openxmlformats.org/markup-compatibility/2006" xmlns:r="http://schemas.openxmlformats.org/officeDocument/2006/relationships" xmlns:w="http://schemas.openxmlformats.org/wordprocessingml/2006/main" xmlns:w14="http://schemas.microsoft.com/office/word/2010/wordml" xmlns:w15="http://schemas.microsoft.com/office/word/2012/wordml" xmlns:w16cex="http://schemas.microsoft.com/office/word/2018/wordml/cex" xmlns:w16cid="http://schemas.microsoft.com/office/word/2016/wordml/cid" xmlns:w16="http://schemas.microsoft.com/office/word/2018/wordml" xmlns:w16sdtdh="http://schemas.microsoft.com/office/word/2020/wordml/sdtdatahash" xmlns:w16sdtfl="http://schemas.microsoft.com/office/word/2024/wordml/sdtformatlock" xmlns:w16se="http://schemas.microsoft.com/office/word/2015/wordml/symex" xmlns:w16du="http://schemas.microsoft.com/office/word/2023/wordml/word16du" mc:Ignorable="w14 w15 w16se w16cid w16 w16cex w16sdtdh w16sdtfl w16du">
   <w:docDefaults>
     <w:rPrDefault>
       <w:rPr>
@@ -7746,4 +7482,10 @@
   <a:objectDefaults/>
   <a:extraClrSchemeLst/>
 </a:theme>
+</file>
+
+<file path=docMetadata/LabelInfo.xml><?xml version="1.0" encoding="utf-8"?>
+<clbl:labelList xmlns:clbl="http://schemas.microsoft.com/office/2020/mipLabelMetadata">
+  <clbl:label id="{a8eec281-aaa3-4dae-ac9b-9a398b9215e7}" enabled="0" method="" siteId="{a8eec281-aaa3-4dae-ac9b-9a398b9215e7}" removed="1"/>
+</clbl:labelList>
 </file>
</xml_diff>